<commit_message>
feat: pair pleadings with evidence catalogs
</commit_message>
<xml_diff>
--- a/skills/legal-os-litigation/assets/templates/仲裁申请书_标准模板.docx
+++ b/skills/legal-os-litigation/assets/templates/仲裁申请书_标准模板.docx
@@ -9,7 +9,7 @@
       </w:pPr>
       <w:r>
         <w:rPr>
-          <w:rFonts w:ascii="Times New Roman" w:hAnsi="Times New Roman" w:eastAsia="黑体"/>
+          <w:rFonts w:ascii="黑体" w:hAnsi="黑体" w:eastAsia="黑体"/>
           <w:b/>
           <w:sz w:val="44"/>
         </w:rPr>
@@ -22,8 +22,7 @@
       </w:pPr>
       <w:r>
         <w:rPr>
-          <w:rFonts w:ascii="Times New Roman" w:hAnsi="Times New Roman" w:eastAsia="仿宋_GB2312"/>
-          <w:sz w:val="32"/>
+          <w:rFonts w:ascii="仿宋_GB2312" w:hAnsi="仿宋_GB2312" w:eastAsia="仿宋_GB2312"/>
         </w:rPr>
         <w:t>申请人：〔姓名或单位名称〕</w:t>
       </w:r>
@@ -34,8 +33,7 @@
       </w:pPr>
       <w:r>
         <w:rPr>
-          <w:rFonts w:ascii="Times New Roman" w:hAnsi="Times New Roman" w:eastAsia="仿宋_GB2312"/>
-          <w:sz w:val="32"/>
+          <w:rFonts w:ascii="仿宋_GB2312" w:hAnsi="仿宋_GB2312" w:eastAsia="仿宋_GB2312"/>
         </w:rPr>
         <w:t>统一社会信用代码/身份证号：〔填写〕</w:t>
       </w:r>
@@ -46,8 +44,7 @@
       </w:pPr>
       <w:r>
         <w:rPr>
-          <w:rFonts w:ascii="Times New Roman" w:hAnsi="Times New Roman" w:eastAsia="仿宋_GB2312"/>
-          <w:sz w:val="32"/>
+          <w:rFonts w:ascii="仿宋_GB2312" w:hAnsi="仿宋_GB2312" w:eastAsia="仿宋_GB2312"/>
         </w:rPr>
         <w:t>住所地：〔填写〕</w:t>
       </w:r>
@@ -58,8 +55,7 @@
       </w:pPr>
       <w:r>
         <w:rPr>
-          <w:rFonts w:ascii="Times New Roman" w:hAnsi="Times New Roman" w:eastAsia="仿宋_GB2312"/>
-          <w:sz w:val="32"/>
+          <w:rFonts w:ascii="仿宋_GB2312" w:hAnsi="仿宋_GB2312" w:eastAsia="仿宋_GB2312"/>
         </w:rPr>
         <w:t>法定代表人/负责人：〔填写，个人可删除本行〕</w:t>
       </w:r>
@@ -70,10 +66,9 @@
       </w:pPr>
       <w:r>
         <w:rPr>
-          <w:rFonts w:ascii="Times New Roman" w:hAnsi="Times New Roman" w:eastAsia="仿宋_GB2312"/>
-          <w:sz w:val="32"/>
+          <w:rFonts w:ascii="仿宋_GB2312" w:hAnsi="仿宋_GB2312" w:eastAsia="仿宋_GB2312"/>
         </w:rPr>
-        <w:t>委托诉讼代理人/委托代理人：〔填写〕</w:t>
+        <w:t>委托代理人：〔填写〕</w:t>
       </w:r>
     </w:p>
     <w:p>
@@ -82,8 +77,7 @@
       </w:pPr>
       <w:r>
         <w:rPr>
-          <w:rFonts w:ascii="Times New Roman" w:hAnsi="Times New Roman" w:eastAsia="仿宋_GB2312"/>
-          <w:sz w:val="32"/>
+          <w:rFonts w:ascii="仿宋_GB2312" w:hAnsi="仿宋_GB2312" w:eastAsia="仿宋_GB2312"/>
         </w:rPr>
         <w:t>联系电话：〔填写〕</w:t>
       </w:r>
@@ -91,8 +85,12 @@
     <w:p>
       <w:pPr>
         <w:pStyle w:val="LegalNoIndent"/>
-        <w:spacing w:line="560" w:lineRule="exact"/>
       </w:pPr>
+      <w:r>
+        <w:rPr>
+          <w:rFonts w:ascii="仿宋_GB2312" w:hAnsi="仿宋_GB2312" w:eastAsia="仿宋_GB2312"/>
+        </w:rPr>
+      </w:r>
     </w:p>
     <w:p>
       <w:pPr>
@@ -100,8 +98,7 @@
       </w:pPr>
       <w:r>
         <w:rPr>
-          <w:rFonts w:ascii="Times New Roman" w:hAnsi="Times New Roman" w:eastAsia="仿宋_GB2312"/>
-          <w:sz w:val="32"/>
+          <w:rFonts w:ascii="仿宋_GB2312" w:hAnsi="仿宋_GB2312" w:eastAsia="仿宋_GB2312"/>
         </w:rPr>
         <w:t>被申请人：〔姓名或单位名称〕</w:t>
       </w:r>
@@ -112,8 +109,7 @@
       </w:pPr>
       <w:r>
         <w:rPr>
-          <w:rFonts w:ascii="Times New Roman" w:hAnsi="Times New Roman" w:eastAsia="仿宋_GB2312"/>
-          <w:sz w:val="32"/>
+          <w:rFonts w:ascii="仿宋_GB2312" w:hAnsi="仿宋_GB2312" w:eastAsia="仿宋_GB2312"/>
         </w:rPr>
         <w:t>统一社会信用代码/身份证号：〔填写〕</w:t>
       </w:r>
@@ -124,8 +120,7 @@
       </w:pPr>
       <w:r>
         <w:rPr>
-          <w:rFonts w:ascii="Times New Roman" w:hAnsi="Times New Roman" w:eastAsia="仿宋_GB2312"/>
-          <w:sz w:val="32"/>
+          <w:rFonts w:ascii="仿宋_GB2312" w:hAnsi="仿宋_GB2312" w:eastAsia="仿宋_GB2312"/>
         </w:rPr>
         <w:t>住所地：〔填写〕</w:t>
       </w:r>
@@ -136,8 +131,7 @@
       </w:pPr>
       <w:r>
         <w:rPr>
-          <w:rFonts w:ascii="Times New Roman" w:hAnsi="Times New Roman" w:eastAsia="仿宋_GB2312"/>
-          <w:sz w:val="32"/>
+          <w:rFonts w:ascii="仿宋_GB2312" w:hAnsi="仿宋_GB2312" w:eastAsia="仿宋_GB2312"/>
         </w:rPr>
         <w:t>法定代表人/负责人：〔填写，个人可删除本行〕</w:t>
       </w:r>
@@ -145,8 +139,12 @@
     <w:p>
       <w:pPr>
         <w:pStyle w:val="LegalNoIndent"/>
-        <w:spacing w:line="560" w:lineRule="exact"/>
       </w:pPr>
+      <w:r>
+        <w:rPr>
+          <w:rFonts w:ascii="仿宋_GB2312" w:hAnsi="仿宋_GB2312" w:eastAsia="仿宋_GB2312"/>
+        </w:rPr>
+      </w:r>
     </w:p>
     <w:p>
       <w:pPr>
@@ -154,8 +152,7 @@
       </w:pPr>
       <w:r>
         <w:rPr>
-          <w:rFonts w:ascii="Times New Roman" w:hAnsi="Times New Roman" w:eastAsia="仿宋_GB2312"/>
-          <w:sz w:val="32"/>
+          <w:rFonts w:ascii="仿宋_GB2312" w:hAnsi="仿宋_GB2312" w:eastAsia="仿宋_GB2312"/>
         </w:rPr>
         <w:t>仲裁依据：〔合同中的仲裁条款/仲裁协议名称及签署日期〕</w:t>
       </w:r>
@@ -163,8 +160,12 @@
     <w:p>
       <w:pPr>
         <w:pStyle w:val="LegalNoIndent"/>
-        <w:spacing w:line="560" w:lineRule="exact"/>
       </w:pPr>
+      <w:r>
+        <w:rPr>
+          <w:rFonts w:ascii="仿宋_GB2312" w:hAnsi="仿宋_GB2312" w:eastAsia="仿宋_GB2312"/>
+        </w:rPr>
+      </w:r>
     </w:p>
     <w:p>
       <w:pPr>
@@ -172,9 +173,7 @@
       </w:pPr>
       <w:r>
         <w:rPr>
-          <w:rFonts w:ascii="Times New Roman" w:hAnsi="Times New Roman" w:eastAsia="黑体"/>
-          <w:b/>
-          <w:sz w:val="32"/>
+          <w:rFonts w:ascii="黑体" w:hAnsi="黑体" w:eastAsia="黑体"/>
         </w:rPr>
         <w:t>一、仲裁请求</w:t>
       </w:r>
@@ -189,8 +188,7 @@
       </w:pPr>
       <w:r>
         <w:rPr>
-          <w:rFonts w:ascii="Times New Roman" w:hAnsi="Times New Roman" w:eastAsia="仿宋_GB2312"/>
-          <w:sz w:val="32"/>
+          <w:rFonts w:ascii="仿宋_GB2312" w:hAnsi="仿宋_GB2312" w:eastAsia="仿宋_GB2312"/>
         </w:rPr>
         <w:t>裁决被申请人向申请人支付〔款项性质〕人民币〔金额〕元；</w:t>
       </w:r>
@@ -205,8 +203,7 @@
       </w:pPr>
       <w:r>
         <w:rPr>
-          <w:rFonts w:ascii="Times New Roman" w:hAnsi="Times New Roman" w:eastAsia="仿宋_GB2312"/>
-          <w:sz w:val="32"/>
+          <w:rFonts w:ascii="仿宋_GB2312" w:hAnsi="仿宋_GB2312" w:eastAsia="仿宋_GB2312"/>
         </w:rPr>
         <w:t>裁决被申请人支付〔利息/违约金/损失〕，以〔基数〕为基数，自〔起算日〕起计算至实际清偿之日止；</w:t>
       </w:r>
@@ -221,17 +218,20 @@
       </w:pPr>
       <w:r>
         <w:rPr>
-          <w:rFonts w:ascii="Times New Roman" w:hAnsi="Times New Roman" w:eastAsia="仿宋_GB2312"/>
-          <w:sz w:val="32"/>
+          <w:rFonts w:ascii="仿宋_GB2312" w:hAnsi="仿宋_GB2312" w:eastAsia="仿宋_GB2312"/>
         </w:rPr>
-        <w:t>裁决本案仲裁费、保全费、律师费等由被申请人承担。</w:t>
+        <w:t>裁决本案仲裁费及依法、依约可主张的其他费用由被申请人承担。</w:t>
       </w:r>
     </w:p>
     <w:p>
       <w:pPr>
         <w:pStyle w:val="LegalNoIndent"/>
-        <w:spacing w:line="560" w:lineRule="exact"/>
       </w:pPr>
+      <w:r>
+        <w:rPr>
+          <w:rFonts w:ascii="仿宋_GB2312" w:hAnsi="仿宋_GB2312" w:eastAsia="仿宋_GB2312"/>
+        </w:rPr>
+      </w:r>
     </w:p>
     <w:p>
       <w:pPr>
@@ -239,9 +239,7 @@
       </w:pPr>
       <w:r>
         <w:rPr>
-          <w:rFonts w:ascii="Times New Roman" w:hAnsi="Times New Roman" w:eastAsia="黑体"/>
-          <w:b/>
-          <w:sz w:val="32"/>
+          <w:rFonts w:ascii="黑体" w:hAnsi="黑体" w:eastAsia="黑体"/>
         </w:rPr>
         <w:t>二、事实与理由</w:t>
       </w:r>
@@ -252,10 +250,9 @@
       </w:pPr>
       <w:r>
         <w:rPr>
-          <w:rFonts w:ascii="Times New Roman" w:hAnsi="Times New Roman" w:eastAsia="仿宋_GB2312"/>
-          <w:sz w:val="32"/>
+          <w:rFonts w:ascii="仿宋_GB2312" w:hAnsi="仿宋_GB2312" w:eastAsia="仿宋_GB2312"/>
         </w:rPr>
-        <w:t>〔第一段：写明合同签订、仲裁条款及交易背景。〕</w:t>
+        <w:t>〔结合本案实际法律关系，写明合同或仲裁协议、履行背景与争议发生经过。〕</w:t>
       </w:r>
     </w:p>
     <w:p>
@@ -264,10 +261,9 @@
       </w:pPr>
       <w:r>
         <w:rPr>
-          <w:rFonts w:ascii="Times New Roman" w:hAnsi="Times New Roman" w:eastAsia="仿宋_GB2312"/>
-          <w:sz w:val="32"/>
+          <w:rFonts w:ascii="仿宋_GB2312" w:hAnsi="仿宋_GB2312" w:eastAsia="仿宋_GB2312"/>
         </w:rPr>
-        <w:t>〔第二段：写明履行过程、争议发生经过及被申请人违约事实。〕</w:t>
+        <w:t>〔围绕每项仲裁请求拆分待证事实、责任基础和金额计算；按争点增删分项，不机械保留示例段落。〕</w:t>
       </w:r>
     </w:p>
     <w:p>
@@ -276,29 +272,9 @@
       </w:pPr>
       <w:r>
         <w:rPr>
-          <w:rFonts w:ascii="Times New Roman" w:hAnsi="Times New Roman" w:eastAsia="仿宋_GB2312"/>
-          <w:sz w:val="32"/>
+          <w:rFonts w:ascii="仿宋_GB2312" w:hAnsi="仿宋_GB2312" w:eastAsia="仿宋_GB2312"/>
         </w:rPr>
-        <w:t>〔第三段：写明损失、金额计算及申请仲裁的理由。〕</w:t>
-      </w:r>
-    </w:p>
-    <w:p>
-      <w:pPr>
-        <w:pStyle w:val="LegalNoIndent"/>
-        <w:spacing w:line="560" w:lineRule="exact"/>
-      </w:pPr>
-    </w:p>
-    <w:p>
-      <w:pPr>
-        <w:pStyle w:val="LegalHeading"/>
-      </w:pPr>
-      <w:r>
-        <w:rPr>
-          <w:rFonts w:ascii="Times New Roman" w:hAnsi="Times New Roman" w:eastAsia="黑体"/>
-          <w:b/>
-          <w:sz w:val="32"/>
-        </w:rPr>
-        <w:t>三、证据和证据来源</w:t>
+        <w:t>〔仅写入已经材料支持并经核验的事实与法律依据；证据名称、编号、页码和证明事项另见同步生成的证据目录。〕</w:t>
       </w:r>
     </w:p>
     <w:p>
@@ -307,17 +283,10 @@
       </w:pPr>
       <w:r>
         <w:rPr>
-          <w:rFonts w:ascii="Times New Roman" w:hAnsi="Times New Roman" w:eastAsia="仿宋_GB2312"/>
-          <w:sz w:val="32"/>
+          <w:rFonts w:ascii="仿宋_GB2312" w:hAnsi="仿宋_GB2312" w:eastAsia="仿宋_GB2312"/>
         </w:rPr>
-        <w:t>申请人将随本申请书提交证据目录及证据材料，具体证据名称、页码和证明事项详见证据目录。</w:t>
+        <w:t>综上，请求仲裁庭依法支持申请人的仲裁请求。</w:t>
       </w:r>
-    </w:p>
-    <w:p>
-      <w:pPr>
-        <w:pStyle w:val="LegalNoIndent"/>
-        <w:spacing w:line="560" w:lineRule="exact"/>
-      </w:pPr>
     </w:p>
     <w:p>
       <w:pPr>
@@ -325,8 +294,17 @@
       </w:pPr>
       <w:r>
         <w:rPr>
-          <w:rFonts w:ascii="Times New Roman" w:hAnsi="Times New Roman" w:eastAsia="仿宋_GB2312"/>
-          <w:sz w:val="32"/>
+          <w:rFonts w:ascii="仿宋_GB2312" w:hAnsi="仿宋_GB2312" w:eastAsia="仿宋_GB2312"/>
+        </w:rPr>
+      </w:r>
+    </w:p>
+    <w:p>
+      <w:pPr>
+        <w:pStyle w:val="LegalNoIndent"/>
+      </w:pPr>
+      <w:r>
+        <w:rPr>
+          <w:rFonts w:ascii="仿宋_GB2312" w:hAnsi="仿宋_GB2312" w:eastAsia="仿宋_GB2312"/>
         </w:rPr>
         <w:t>此致</w:t>
       </w:r>
@@ -337,8 +315,7 @@
       </w:pPr>
       <w:r>
         <w:rPr>
-          <w:rFonts w:ascii="Times New Roman" w:hAnsi="Times New Roman" w:eastAsia="仿宋_GB2312"/>
-          <w:sz w:val="32"/>
+          <w:rFonts w:ascii="仿宋_GB2312" w:hAnsi="仿宋_GB2312" w:eastAsia="仿宋_GB2312"/>
         </w:rPr>
         <w:t>〔仲裁委员会名称〕</w:t>
       </w:r>
@@ -346,14 +323,22 @@
     <w:p>
       <w:pPr>
         <w:pStyle w:val="LegalNoIndent"/>
-        <w:spacing w:line="560" w:lineRule="exact"/>
       </w:pPr>
+      <w:r>
+        <w:rPr>
+          <w:rFonts w:ascii="仿宋_GB2312" w:hAnsi="仿宋_GB2312" w:eastAsia="仿宋_GB2312"/>
+        </w:rPr>
+      </w:r>
     </w:p>
     <w:p>
       <w:pPr>
         <w:pStyle w:val="LegalNoIndent"/>
-        <w:spacing w:line="560" w:lineRule="exact"/>
       </w:pPr>
+      <w:r>
+        <w:rPr>
+          <w:rFonts w:ascii="仿宋_GB2312" w:hAnsi="仿宋_GB2312" w:eastAsia="仿宋_GB2312"/>
+        </w:rPr>
+      </w:r>
     </w:p>
     <w:p>
       <w:pPr>
@@ -361,8 +346,7 @@
       </w:pPr>
       <w:r>
         <w:rPr>
-          <w:rFonts w:ascii="Times New Roman" w:hAnsi="Times New Roman" w:eastAsia="仿宋_GB2312"/>
-          <w:sz w:val="32"/>
+          <w:rFonts w:ascii="仿宋_GB2312" w:hAnsi="仿宋_GB2312" w:eastAsia="仿宋_GB2312"/>
         </w:rPr>
         <w:t>申请人：〔签名或盖章〕</w:t>
       </w:r>
@@ -373,8 +357,7 @@
       </w:pPr>
       <w:r>
         <w:rPr>
-          <w:rFonts w:ascii="Times New Roman" w:hAnsi="Times New Roman" w:eastAsia="仿宋_GB2312"/>
-          <w:sz w:val="32"/>
+          <w:rFonts w:ascii="仿宋_GB2312" w:hAnsi="仿宋_GB2312" w:eastAsia="仿宋_GB2312"/>
         </w:rPr>
         <w:t>〔    〕年〔  〕月〔  〕日</w:t>
       </w:r>

</xml_diff>